<commit_message>
CI: frontend tests, pinned Supabase CLI, deploys wait for tests
- test.yml gains a frontend-tests job (npm ci, Jest, and a static `next build` check with
  placeholder env values), so UI and build breakages show up on PRs.
- The integration job pins the Supabase CLI to 2.122.0 instead of `latest`, so a new CLI
  release can't change CI behaviour without a code change.
- test.yml is now reusable (workflow_call). Both deploy workflows run it as a `tests` job and
  their `deploy` job declares `needs: tests`, so a commit with failing tests is never deployed.
  Its own push-to-main trigger is removed so tests don't run twice; path filters are unchanged.
- docs/CI_CD.docx updated to match.

Co-Authored-By: Claude Opus 5.5 <noreply@anthropic.com>
</commit_message>
<xml_diff>
--- a/docs/CI_CD.docx
+++ b/docs/CI_CD.docx
@@ -55,7 +55,7 @@
     <w:sdt>
       <w:sdtPr>
         <w:alias w:val="Contents"/>
-        <w:id w:val="-1277089692"/>
+        <w:id w:val="-226460061"/>
       </w:sdtPr>
       <w:sdtEndPr/>
       <w:sdtContent>
@@ -84,7 +84,7 @@
           <w:r>
             <w:fldChar w:fldCharType="separate"/>
           </w:r>
-          <w:hyperlink w:anchor="_Toc243757351" w:history="1">
+          <w:hyperlink w:anchor="_Toc243759546" w:history="1">
             <w:r>
               <w:rPr>
                 <w:rStyle w:val="Hyperlink"/>
@@ -108,7 +108,7 @@
               <w:rPr>
                 <w:noProof/>
               </w:rPr>
-              <w:instrText xml:space="preserve"> PAGEREF _Toc243757351 \h </w:instrText>
+              <w:instrText xml:space="preserve"> PAGEREF _Toc243759546 \h </w:instrText>
             </w:r>
             <w:r>
               <w:rPr>
@@ -151,7 +151,7 @@
               <w14:ligatures w14:val="standardContextual"/>
             </w:rPr>
           </w:pPr>
-          <w:hyperlink w:anchor="_Toc243757352" w:history="1">
+          <w:hyperlink w:anchor="_Toc243759547" w:history="1">
             <w:r>
               <w:rPr>
                 <w:rStyle w:val="Hyperlink"/>
@@ -175,7 +175,7 @@
               <w:rPr>
                 <w:noProof/>
               </w:rPr>
-              <w:instrText xml:space="preserve"> PAGEREF _Toc243757352 \h </w:instrText>
+              <w:instrText xml:space="preserve"> PAGEREF _Toc243759547 \h </w:instrText>
             </w:r>
             <w:r>
               <w:rPr>
@@ -218,7 +218,7 @@
               <w14:ligatures w14:val="standardContextual"/>
             </w:rPr>
           </w:pPr>
-          <w:hyperlink w:anchor="_Toc243757353" w:history="1">
+          <w:hyperlink w:anchor="_Toc243759548" w:history="1">
             <w:r>
               <w:rPr>
                 <w:rStyle w:val="Hyperlink"/>
@@ -242,7 +242,7 @@
               <w:rPr>
                 <w:noProof/>
               </w:rPr>
-              <w:instrText xml:space="preserve"> PAGEREF _Toc243757353 \h </w:instrText>
+              <w:instrText xml:space="preserve"> PAGEREF _Toc243759548 \h </w:instrText>
             </w:r>
             <w:r>
               <w:rPr>
@@ -285,7 +285,7 @@
               <w14:ligatures w14:val="standardContextual"/>
             </w:rPr>
           </w:pPr>
-          <w:hyperlink w:anchor="_Toc243757354" w:history="1">
+          <w:hyperlink w:anchor="_Toc243759549" w:history="1">
             <w:r>
               <w:rPr>
                 <w:rStyle w:val="Hyperlink"/>
@@ -309,7 +309,7 @@
               <w:rPr>
                 <w:noProof/>
               </w:rPr>
-              <w:instrText xml:space="preserve"> PAGEREF _Toc243757354 \h </w:instrText>
+              <w:instrText xml:space="preserve"> PAGEREF _Toc243759549 \h </w:instrText>
             </w:r>
             <w:r>
               <w:rPr>
@@ -352,7 +352,7 @@
               <w14:ligatures w14:val="standardContextual"/>
             </w:rPr>
           </w:pPr>
-          <w:hyperlink w:anchor="_Toc243757355" w:history="1">
+          <w:hyperlink w:anchor="_Toc243759550" w:history="1">
             <w:r>
               <w:rPr>
                 <w:rStyle w:val="Hyperlink"/>
@@ -376,7 +376,7 @@
               <w:rPr>
                 <w:noProof/>
               </w:rPr>
-              <w:instrText xml:space="preserve"> PAGEREF _Toc243757355 \h </w:instrText>
+              <w:instrText xml:space="preserve"> PAGEREF _Toc243759550 \h </w:instrText>
             </w:r>
             <w:r>
               <w:rPr>
@@ -419,7 +419,7 @@
               <w14:ligatures w14:val="standardContextual"/>
             </w:rPr>
           </w:pPr>
-          <w:hyperlink w:anchor="_Toc243757356" w:history="1">
+          <w:hyperlink w:anchor="_Toc243759551" w:history="1">
             <w:r>
               <w:rPr>
                 <w:rStyle w:val="Hyperlink"/>
@@ -443,7 +443,7 @@
               <w:rPr>
                 <w:noProof/>
               </w:rPr>
-              <w:instrText xml:space="preserve"> PAGEREF _Toc243757356 \h </w:instrText>
+              <w:instrText xml:space="preserve"> PAGEREF _Toc243759551 \h </w:instrText>
             </w:r>
             <w:r>
               <w:rPr>
@@ -486,7 +486,7 @@
               <w14:ligatures w14:val="standardContextual"/>
             </w:rPr>
           </w:pPr>
-          <w:hyperlink w:anchor="_Toc243757357" w:history="1">
+          <w:hyperlink w:anchor="_Toc243759552" w:history="1">
             <w:r>
               <w:rPr>
                 <w:rStyle w:val="Hyperlink"/>
@@ -510,7 +510,7 @@
               <w:rPr>
                 <w:noProof/>
               </w:rPr>
-              <w:instrText xml:space="preserve"> PAGEREF _Toc243757357 \h </w:instrText>
+              <w:instrText xml:space="preserve"> PAGEREF _Toc243759552 \h </w:instrText>
             </w:r>
             <w:r>
               <w:rPr>
@@ -553,7 +553,7 @@
               <w14:ligatures w14:val="standardContextual"/>
             </w:rPr>
           </w:pPr>
-          <w:hyperlink w:anchor="_Toc243757358" w:history="1">
+          <w:hyperlink w:anchor="_Toc243759553" w:history="1">
             <w:r>
               <w:rPr>
                 <w:rStyle w:val="Hyperlink"/>
@@ -577,7 +577,7 @@
               <w:rPr>
                 <w:noProof/>
               </w:rPr>
-              <w:instrText xml:space="preserve"> PAGEREF _Toc243757358 \h </w:instrText>
+              <w:instrText xml:space="preserve"> PAGEREF _Toc243759553 \h </w:instrText>
             </w:r>
             <w:r>
               <w:rPr>
@@ -620,7 +620,7 @@
               <w14:ligatures w14:val="standardContextual"/>
             </w:rPr>
           </w:pPr>
-          <w:hyperlink w:anchor="_Toc243757359" w:history="1">
+          <w:hyperlink w:anchor="_Toc243759554" w:history="1">
             <w:r>
               <w:rPr>
                 <w:rStyle w:val="Hyperlink"/>
@@ -644,7 +644,7 @@
               <w:rPr>
                 <w:noProof/>
               </w:rPr>
-              <w:instrText xml:space="preserve"> PAGEREF _Toc243757359 \h </w:instrText>
+              <w:instrText xml:space="preserve"> PAGEREF _Toc243759554 \h </w:instrText>
             </w:r>
             <w:r>
               <w:rPr>
@@ -687,7 +687,7 @@
               <w14:ligatures w14:val="standardContextual"/>
             </w:rPr>
           </w:pPr>
-          <w:hyperlink w:anchor="_Toc243757360" w:history="1">
+          <w:hyperlink w:anchor="_Toc243759555" w:history="1">
             <w:r>
               <w:rPr>
                 <w:rStyle w:val="Hyperlink"/>
@@ -711,7 +711,7 @@
               <w:rPr>
                 <w:noProof/>
               </w:rPr>
-              <w:instrText xml:space="preserve"> PAGEREF _Toc243757360 \h </w:instrText>
+              <w:instrText xml:space="preserve"> PAGEREF _Toc243759555 \h </w:instrText>
             </w:r>
             <w:r>
               <w:rPr>
@@ -754,7 +754,7 @@
               <w14:ligatures w14:val="standardContextual"/>
             </w:rPr>
           </w:pPr>
-          <w:hyperlink w:anchor="_Toc243757361" w:history="1">
+          <w:hyperlink w:anchor="_Toc243759556" w:history="1">
             <w:r>
               <w:rPr>
                 <w:rStyle w:val="Hyperlink"/>
@@ -778,7 +778,7 @@
               <w:rPr>
                 <w:noProof/>
               </w:rPr>
-              <w:instrText xml:space="preserve"> PAGEREF _Toc243757361 \h </w:instrText>
+              <w:instrText xml:space="preserve"> PAGEREF _Toc243759556 \h </w:instrText>
             </w:r>
             <w:r>
               <w:rPr>
@@ -821,7 +821,7 @@
               <w14:ligatures w14:val="standardContextual"/>
             </w:rPr>
           </w:pPr>
-          <w:hyperlink w:anchor="_Toc243757362" w:history="1">
+          <w:hyperlink w:anchor="_Toc243759557" w:history="1">
             <w:r>
               <w:rPr>
                 <w:rStyle w:val="Hyperlink"/>
@@ -845,7 +845,7 @@
               <w:rPr>
                 <w:noProof/>
               </w:rPr>
-              <w:instrText xml:space="preserve"> PAGEREF _Toc243757362 \h </w:instrText>
+              <w:instrText xml:space="preserve"> PAGEREF _Toc243759557 \h </w:instrText>
             </w:r>
             <w:r>
               <w:rPr>
@@ -888,7 +888,7 @@
               <w14:ligatures w14:val="standardContextual"/>
             </w:rPr>
           </w:pPr>
-          <w:hyperlink w:anchor="_Toc243757363" w:history="1">
+          <w:hyperlink w:anchor="_Toc243759558" w:history="1">
             <w:r>
               <w:rPr>
                 <w:rStyle w:val="Hyperlink"/>
@@ -912,7 +912,7 @@
               <w:rPr>
                 <w:noProof/>
               </w:rPr>
-              <w:instrText xml:space="preserve"> PAGEREF _Toc243757363 \h </w:instrText>
+              <w:instrText xml:space="preserve"> PAGEREF _Toc243759558 \h </w:instrText>
             </w:r>
             <w:r>
               <w:rPr>
@@ -955,7 +955,7 @@
               <w14:ligatures w14:val="standardContextual"/>
             </w:rPr>
           </w:pPr>
-          <w:hyperlink w:anchor="_Toc243757364" w:history="1">
+          <w:hyperlink w:anchor="_Toc243759559" w:history="1">
             <w:r>
               <w:rPr>
                 <w:rStyle w:val="Hyperlink"/>
@@ -979,7 +979,7 @@
               <w:rPr>
                 <w:noProof/>
               </w:rPr>
-              <w:instrText xml:space="preserve"> PAGEREF _Toc243757364 \h </w:instrText>
+              <w:instrText xml:space="preserve"> PAGEREF _Toc243759559 \h </w:instrText>
             </w:r>
             <w:r>
               <w:rPr>
@@ -1022,7 +1022,7 @@
               <w14:ligatures w14:val="standardContextual"/>
             </w:rPr>
           </w:pPr>
-          <w:hyperlink w:anchor="_Toc243757365" w:history="1">
+          <w:hyperlink w:anchor="_Toc243759560" w:history="1">
             <w:r>
               <w:rPr>
                 <w:rStyle w:val="Hyperlink"/>
@@ -1046,7 +1046,7 @@
               <w:rPr>
                 <w:noProof/>
               </w:rPr>
-              <w:instrText xml:space="preserve"> PAGEREF _Toc243757365 \h </w:instrText>
+              <w:instrText xml:space="preserve"> PAGEREF _Toc243759560 \h </w:instrText>
             </w:r>
             <w:r>
               <w:rPr>
@@ -1089,7 +1089,7 @@
               <w14:ligatures w14:val="standardContextual"/>
             </w:rPr>
           </w:pPr>
-          <w:hyperlink w:anchor="_Toc243757366" w:history="1">
+          <w:hyperlink w:anchor="_Toc243759561" w:history="1">
             <w:r>
               <w:rPr>
                 <w:rStyle w:val="Hyperlink"/>
@@ -1113,7 +1113,7 @@
               <w:rPr>
                 <w:noProof/>
               </w:rPr>
-              <w:instrText xml:space="preserve"> PAGEREF _Toc243757366 \h </w:instrText>
+              <w:instrText xml:space="preserve"> PAGEREF _Toc243759561 \h </w:instrText>
             </w:r>
             <w:r>
               <w:rPr>
@@ -1156,7 +1156,7 @@
               <w14:ligatures w14:val="standardContextual"/>
             </w:rPr>
           </w:pPr>
-          <w:hyperlink w:anchor="_Toc243757367" w:history="1">
+          <w:hyperlink w:anchor="_Toc243759562" w:history="1">
             <w:r>
               <w:rPr>
                 <w:rStyle w:val="Hyperlink"/>
@@ -1180,7 +1180,7 @@
               <w:rPr>
                 <w:noProof/>
               </w:rPr>
-              <w:instrText xml:space="preserve"> PAGEREF _Toc243757367 \h </w:instrText>
+              <w:instrText xml:space="preserve"> PAGEREF _Toc243759562 \h </w:instrText>
             </w:r>
             <w:r>
               <w:rPr>
@@ -1197,7 +1197,7 @@
               <w:rPr>
                 <w:noProof/>
               </w:rPr>
-              <w:t>11</w:t>
+              <w:t>12</w:t>
             </w:r>
             <w:r>
               <w:rPr>
@@ -1223,7 +1223,7 @@
               <w14:ligatures w14:val="standardContextual"/>
             </w:rPr>
           </w:pPr>
-          <w:hyperlink w:anchor="_Toc243757368" w:history="1">
+          <w:hyperlink w:anchor="_Toc243759563" w:history="1">
             <w:r>
               <w:rPr>
                 <w:rStyle w:val="Hyperlink"/>
@@ -1247,7 +1247,7 @@
               <w:rPr>
                 <w:noProof/>
               </w:rPr>
-              <w:instrText xml:space="preserve"> PAGEREF _Toc243757368 \h </w:instrText>
+              <w:instrText xml:space="preserve"> PAGEREF _Toc243759563 \h </w:instrText>
             </w:r>
             <w:r>
               <w:rPr>
@@ -1290,7 +1290,7 @@
               <w14:ligatures w14:val="standardContextual"/>
             </w:rPr>
           </w:pPr>
-          <w:hyperlink w:anchor="_Toc243757369" w:history="1">
+          <w:hyperlink w:anchor="_Toc243759564" w:history="1">
             <w:r>
               <w:rPr>
                 <w:rStyle w:val="Hyperlink"/>
@@ -1314,7 +1314,7 @@
               <w:rPr>
                 <w:noProof/>
               </w:rPr>
-              <w:instrText xml:space="preserve"> PAGEREF _Toc243757369 \h </w:instrText>
+              <w:instrText xml:space="preserve"> PAGEREF _Toc243759564 \h </w:instrText>
             </w:r>
             <w:r>
               <w:rPr>
@@ -1357,7 +1357,7 @@
               <w14:ligatures w14:val="standardContextual"/>
             </w:rPr>
           </w:pPr>
-          <w:hyperlink w:anchor="_Toc243757370" w:history="1">
+          <w:hyperlink w:anchor="_Toc243759565" w:history="1">
             <w:r>
               <w:rPr>
                 <w:rStyle w:val="Hyperlink"/>
@@ -1381,7 +1381,7 @@
               <w:rPr>
                 <w:noProof/>
               </w:rPr>
-              <w:instrText xml:space="preserve"> PAGEREF _Toc243757370 \h </w:instrText>
+              <w:instrText xml:space="preserve"> PAGEREF _Toc243759565 \h </w:instrText>
             </w:r>
             <w:r>
               <w:rPr>
@@ -1421,7 +1421,7 @@
         <w:keepNext/>
         <w:keepLines/>
       </w:pPr>
-      <w:bookmarkStart w:id="0" w:name="_Toc243757351"/>
+      <w:bookmarkStart w:id="0" w:name="_Toc243759546"/>
       <w:r>
         <w:t>Part 1. What CI/CD is</w:t>
       </w:r>
@@ -1433,7 +1433,7 @@
         <w:keepNext/>
         <w:keepLines/>
       </w:pPr>
-      <w:bookmarkStart w:id="1" w:name="_Toc243757352"/>
+      <w:bookmarkStart w:id="1" w:name="_Toc243759547"/>
       <w:r>
         <w:t>Continuous Integration (CI)</w:t>
       </w:r>
@@ -1481,7 +1481,7 @@
         <w:keepNext/>
         <w:keepLines/>
       </w:pPr>
-      <w:bookmarkStart w:id="2" w:name="_Toc243757353"/>
+      <w:bookmarkStart w:id="2" w:name="_Toc243759548"/>
       <w:r>
         <w:t>Continuous Delivery / Deployment (CD)</w:t>
       </w:r>
@@ -1523,7 +1523,7 @@
         <w:keepNext/>
         <w:keepLines/>
       </w:pPr>
-      <w:bookmarkStart w:id="3" w:name="_Toc243757354"/>
+      <w:bookmarkStart w:id="3" w:name="_Toc243759549"/>
       <w:r>
         <w:t>Why it matters</w:t>
       </w:r>
@@ -1650,7 +1650,7 @@
         <w:keepNext/>
         <w:keepLines/>
       </w:pPr>
-      <w:bookmarkStart w:id="4" w:name="_Toc243757355"/>
+      <w:bookmarkStart w:id="4" w:name="_Toc243759550"/>
       <w:r>
         <w:t>Part 2. How CI/CD is set up in our repository</w:t>
       </w:r>
@@ -1662,7 +1662,7 @@
         <w:keepNext/>
         <w:keepLines/>
       </w:pPr>
-      <w:bookmarkStart w:id="5" w:name="_Toc243757356"/>
+      <w:bookmarkStart w:id="5" w:name="_Toc243759551"/>
       <w:r>
         <w:t>The branches</w:t>
       </w:r>
@@ -2075,7 +2075,7 @@
         <w:keepNext/>
         <w:keepLines/>
       </w:pPr>
-      <w:bookmarkStart w:id="6" w:name="_Toc243757357"/>
+      <w:bookmarkStart w:id="6" w:name="_Toc243759552"/>
       <w:r>
         <w:t>The workflows (.github/workflows/)</w:t>
       </w:r>
@@ -2260,7 +2260,17 @@
           </w:tcPr>
           <w:p>
             <w:r>
-              <w:t xml:space="preserve">Every pull request; every push to </w:t>
+              <w:t xml:space="preserve">Every pull request; and </w:t>
+            </w:r>
+            <w:r>
+              <w:rPr>
+                <w:b/>
+                <w:bCs/>
+              </w:rPr>
+              <w:t>called by both deploy workflows</w:t>
+            </w:r>
+            <w:r>
+              <w:t xml:space="preserve"> (</w:t>
             </w:r>
             <w:r>
               <w:rPr>
@@ -2269,7 +2279,10 @@
                 <w:sz w:val="19"/>
                 <w:szCs w:val="19"/>
               </w:rPr>
-              <w:t>main</w:t>
+              <w:t>workflow_call</w:t>
+            </w:r>
+            <w:r>
+              <w:t>) before they deploy</w:t>
             </w:r>
           </w:p>
         </w:tc>
@@ -2347,7 +2360,7 @@
               <w:t>integration-tests</w:t>
             </w:r>
             <w:r>
-              <w:t xml:space="preserve">: starts a throwaway local Supabase, applies </w:t>
+              <w:t xml:space="preserve">: starts a throwaway local Supabase (CLI pinned to 2.122.0), applies </w:t>
             </w:r>
             <w:r>
               <w:rPr>
@@ -2371,51 +2384,18 @@
               <w:t>tests/integration</w:t>
             </w:r>
             <w:r>
-              <w:t>. Failing tests and schema errors are posted as annotations on the PR</w:t>
-            </w:r>
-          </w:p>
-        </w:tc>
-        <w:tc>
-          <w:tcPr>
-            <w:tcW w:w="1489" w:type="dxa"/>
-            <w:tcBorders>
-              <w:top w:val="single" w:sz="4" w:space="0" w:color="D9D4C7"/>
-              <w:left w:val="single" w:sz="4" w:space="0" w:color="D9D4C7"/>
-              <w:bottom w:val="single" w:sz="4" w:space="0" w:color="D9D4C7"/>
-              <w:right w:val="single" w:sz="4" w:space="0" w:color="D9D4C7"/>
-            </w:tcBorders>
-            <w:tcMar>
-              <w:top w:w="70" w:type="dxa"/>
-              <w:left w:w="110" w:type="dxa"/>
-              <w:bottom w:w="70" w:type="dxa"/>
-              <w:right w:w="110" w:type="dxa"/>
-            </w:tcMar>
-          </w:tcPr>
-          <w:p>
-            <w:r>
-              <w:t>CI</w:t>
-            </w:r>
-          </w:p>
-        </w:tc>
-      </w:tr>
-      <w:tr>
-        <w:tc>
-          <w:tcPr>
-            <w:tcW w:w="1861" w:type="dxa"/>
-            <w:tcBorders>
-              <w:top w:val="single" w:sz="4" w:space="0" w:color="D9D4C7"/>
-              <w:left w:val="single" w:sz="4" w:space="0" w:color="D9D4C7"/>
-              <w:bottom w:val="single" w:sz="4" w:space="0" w:color="D9D4C7"/>
-              <w:right w:val="single" w:sz="4" w:space="0" w:color="D9D4C7"/>
-            </w:tcBorders>
-            <w:tcMar>
-              <w:top w:w="70" w:type="dxa"/>
-              <w:left w:w="110" w:type="dxa"/>
-              <w:bottom w:w="70" w:type="dxa"/>
-              <w:right w:w="110" w:type="dxa"/>
-            </w:tcMar>
-          </w:tcPr>
-          <w:p>
+              <w:t xml:space="preserve">. Job </w:t>
+            </w:r>
+            <w:r>
+              <w:rPr>
+                <w:b/>
+                <w:bCs/>
+              </w:rPr>
+              <w:t>frontend-tests</w:t>
+            </w:r>
+            <w:r>
+              <w:t xml:space="preserve">: </w:t>
+            </w:r>
             <w:r>
               <w:rPr>
                 <w:rFonts w:ascii="Consolas" w:eastAsia="Consolas" w:hAnsi="Consolas" w:cs="Consolas"/>
@@ -2423,29 +2403,10 @@
                 <w:sz w:val="19"/>
                 <w:szCs w:val="19"/>
               </w:rPr>
-              <w:t>deploy-backend.yml</w:t>
-            </w:r>
-          </w:p>
-        </w:tc>
-        <w:tc>
-          <w:tcPr>
-            <w:tcW w:w="2047" w:type="dxa"/>
-            <w:tcBorders>
-              <w:top w:val="single" w:sz="4" w:space="0" w:color="D9D4C7"/>
-              <w:left w:val="single" w:sz="4" w:space="0" w:color="D9D4C7"/>
-              <w:bottom w:val="single" w:sz="4" w:space="0" w:color="D9D4C7"/>
-              <w:right w:val="single" w:sz="4" w:space="0" w:color="D9D4C7"/>
-            </w:tcBorders>
-            <w:tcMar>
-              <w:top w:w="70" w:type="dxa"/>
-              <w:left w:w="110" w:type="dxa"/>
-              <w:bottom w:w="70" w:type="dxa"/>
-              <w:right w:w="110" w:type="dxa"/>
-            </w:tcMar>
-          </w:tcPr>
-          <w:p>
-            <w:r>
-              <w:t xml:space="preserve">Push to </w:t>
+              <w:t>npm ci</w:t>
+            </w:r>
+            <w:r>
+              <w:t xml:space="preserve">, Jest, and a </w:t>
             </w:r>
             <w:r>
               <w:rPr>
@@ -2454,32 +2415,10 @@
                 <w:sz w:val="19"/>
                 <w:szCs w:val="19"/>
               </w:rPr>
-              <w:t>main</w:t>
-            </w:r>
-            <w:r>
-              <w:t xml:space="preserve"> (not frontend-only changes)</w:t>
-            </w:r>
-          </w:p>
-        </w:tc>
-        <w:tc>
-          <w:tcPr>
-            <w:tcW w:w="3909" w:type="dxa"/>
-            <w:tcBorders>
-              <w:top w:val="single" w:sz="4" w:space="0" w:color="D9D4C7"/>
-              <w:left w:val="single" w:sz="4" w:space="0" w:color="D9D4C7"/>
-              <w:bottom w:val="single" w:sz="4" w:space="0" w:color="D9D4C7"/>
-              <w:right w:val="single" w:sz="4" w:space="0" w:color="D9D4C7"/>
-            </w:tcBorders>
-            <w:tcMar>
-              <w:top w:w="70" w:type="dxa"/>
-              <w:left w:w="110" w:type="dxa"/>
-              <w:bottom w:w="70" w:type="dxa"/>
-              <w:right w:w="110" w:type="dxa"/>
-            </w:tcMar>
-          </w:tcPr>
-          <w:p>
-            <w:r>
-              <w:t>Builds the Docker image in Azure Container Registry and updates the Container App</w:t>
+              <w:t>next build</w:t>
+            </w:r>
+            <w:r>
+              <w:t xml:space="preserve"> check. Failures are posted as annotations on the PR</w:t>
             </w:r>
           </w:p>
         </w:tc>
@@ -2501,7 +2440,7 @@
           </w:tcPr>
           <w:p>
             <w:r>
-              <w:t>CD</w:t>
+              <w:t>CI</w:t>
             </w:r>
           </w:p>
         </w:tc>
@@ -2531,7 +2470,7 @@
                 <w:sz w:val="19"/>
                 <w:szCs w:val="19"/>
               </w:rPr>
-              <w:t>deploy-frontend.yml</w:t>
+              <w:t>deploy-backend.yml</w:t>
             </w:r>
           </w:p>
         </w:tc>
@@ -2565,7 +2504,7 @@
               <w:t>main</w:t>
             </w:r>
             <w:r>
-              <w:t xml:space="preserve"> (frontend changes)</w:t>
+              <w:t xml:space="preserve"> (not frontend-only changes)</w:t>
             </w:r>
           </w:p>
         </w:tc>
@@ -2587,7 +2526,17 @@
           </w:tcPr>
           <w:p>
             <w:r>
-              <w:t xml:space="preserve">Runs </w:t>
+              <w:t xml:space="preserve">Job </w:t>
+            </w:r>
+            <w:r>
+              <w:rPr>
+                <w:b/>
+                <w:bCs/>
+              </w:rPr>
+              <w:t>tests</w:t>
+            </w:r>
+            <w:r>
+              <w:t xml:space="preserve"> runs </w:t>
             </w:r>
             <w:r>
               <w:rPr>
@@ -2596,10 +2545,20 @@
                 <w:sz w:val="19"/>
                 <w:szCs w:val="19"/>
               </w:rPr>
-              <w:t>next build</w:t>
-            </w:r>
-            <w:r>
-              <w:t xml:space="preserve"> as a static export and uploads </w:t>
+              <w:t>test.yml</w:t>
+            </w:r>
+            <w:r>
+              <w:t xml:space="preserve">; job </w:t>
+            </w:r>
+            <w:r>
+              <w:rPr>
+                <w:b/>
+                <w:bCs/>
+              </w:rPr>
+              <w:t>deploy</w:t>
+            </w:r>
+            <w:r>
+              <w:t xml:space="preserve"> (</w:t>
             </w:r>
             <w:r>
               <w:rPr>
@@ -2608,10 +2567,10 @@
                 <w:sz w:val="19"/>
                 <w:szCs w:val="19"/>
               </w:rPr>
-              <w:t>frontend/out</w:t>
-            </w:r>
-            <w:r>
-              <w:t xml:space="preserve"> to Static Web Apps</w:t>
+              <w:t>needs: tests</w:t>
+            </w:r>
+            <w:r>
+              <w:t>) builds the Docker image in Azure Container Registry and updates the Container App only if every test passed</w:t>
             </w:r>
           </w:p>
         </w:tc>
@@ -2663,6 +2622,182 @@
                 <w:sz w:val="19"/>
                 <w:szCs w:val="19"/>
               </w:rPr>
+              <w:t>deploy-frontend.yml</w:t>
+            </w:r>
+          </w:p>
+        </w:tc>
+        <w:tc>
+          <w:tcPr>
+            <w:tcW w:w="2047" w:type="dxa"/>
+            <w:tcBorders>
+              <w:top w:val="single" w:sz="4" w:space="0" w:color="D9D4C7"/>
+              <w:left w:val="single" w:sz="4" w:space="0" w:color="D9D4C7"/>
+              <w:bottom w:val="single" w:sz="4" w:space="0" w:color="D9D4C7"/>
+              <w:right w:val="single" w:sz="4" w:space="0" w:color="D9D4C7"/>
+            </w:tcBorders>
+            <w:tcMar>
+              <w:top w:w="70" w:type="dxa"/>
+              <w:left w:w="110" w:type="dxa"/>
+              <w:bottom w:w="70" w:type="dxa"/>
+              <w:right w:w="110" w:type="dxa"/>
+            </w:tcMar>
+          </w:tcPr>
+          <w:p>
+            <w:r>
+              <w:t xml:space="preserve">Push to </w:t>
+            </w:r>
+            <w:r>
+              <w:rPr>
+                <w:rFonts w:ascii="Consolas" w:eastAsia="Consolas" w:hAnsi="Consolas" w:cs="Consolas"/>
+                <w:color w:val="5A3A0E"/>
+                <w:sz w:val="19"/>
+                <w:szCs w:val="19"/>
+              </w:rPr>
+              <w:t>main</w:t>
+            </w:r>
+            <w:r>
+              <w:t xml:space="preserve"> (frontend changes)</w:t>
+            </w:r>
+          </w:p>
+        </w:tc>
+        <w:tc>
+          <w:tcPr>
+            <w:tcW w:w="3909" w:type="dxa"/>
+            <w:tcBorders>
+              <w:top w:val="single" w:sz="4" w:space="0" w:color="D9D4C7"/>
+              <w:left w:val="single" w:sz="4" w:space="0" w:color="D9D4C7"/>
+              <w:bottom w:val="single" w:sz="4" w:space="0" w:color="D9D4C7"/>
+              <w:right w:val="single" w:sz="4" w:space="0" w:color="D9D4C7"/>
+            </w:tcBorders>
+            <w:tcMar>
+              <w:top w:w="70" w:type="dxa"/>
+              <w:left w:w="110" w:type="dxa"/>
+              <w:bottom w:w="70" w:type="dxa"/>
+              <w:right w:w="110" w:type="dxa"/>
+            </w:tcMar>
+          </w:tcPr>
+          <w:p>
+            <w:r>
+              <w:t xml:space="preserve">Job </w:t>
+            </w:r>
+            <w:r>
+              <w:rPr>
+                <w:b/>
+                <w:bCs/>
+              </w:rPr>
+              <w:t>tests</w:t>
+            </w:r>
+            <w:r>
+              <w:t xml:space="preserve"> runs </w:t>
+            </w:r>
+            <w:r>
+              <w:rPr>
+                <w:rFonts w:ascii="Consolas" w:eastAsia="Consolas" w:hAnsi="Consolas" w:cs="Consolas"/>
+                <w:color w:val="5A3A0E"/>
+                <w:sz w:val="19"/>
+                <w:szCs w:val="19"/>
+              </w:rPr>
+              <w:t>test.yml</w:t>
+            </w:r>
+            <w:r>
+              <w:t xml:space="preserve">; job </w:t>
+            </w:r>
+            <w:r>
+              <w:rPr>
+                <w:b/>
+                <w:bCs/>
+              </w:rPr>
+              <w:t>deploy</w:t>
+            </w:r>
+            <w:r>
+              <w:t xml:space="preserve"> (</w:t>
+            </w:r>
+            <w:r>
+              <w:rPr>
+                <w:rFonts w:ascii="Consolas" w:eastAsia="Consolas" w:hAnsi="Consolas" w:cs="Consolas"/>
+                <w:color w:val="5A3A0E"/>
+                <w:sz w:val="19"/>
+                <w:szCs w:val="19"/>
+              </w:rPr>
+              <w:t>needs: tests</w:t>
+            </w:r>
+            <w:r>
+              <w:t xml:space="preserve">) runs </w:t>
+            </w:r>
+            <w:r>
+              <w:rPr>
+                <w:rFonts w:ascii="Consolas" w:eastAsia="Consolas" w:hAnsi="Consolas" w:cs="Consolas"/>
+                <w:color w:val="5A3A0E"/>
+                <w:sz w:val="19"/>
+                <w:szCs w:val="19"/>
+              </w:rPr>
+              <w:t>next build</w:t>
+            </w:r>
+            <w:r>
+              <w:t xml:space="preserve"> as a static export and uploads </w:t>
+            </w:r>
+            <w:r>
+              <w:rPr>
+                <w:rFonts w:ascii="Consolas" w:eastAsia="Consolas" w:hAnsi="Consolas" w:cs="Consolas"/>
+                <w:color w:val="5A3A0E"/>
+                <w:sz w:val="19"/>
+                <w:szCs w:val="19"/>
+              </w:rPr>
+              <w:t>frontend/out</w:t>
+            </w:r>
+            <w:r>
+              <w:t xml:space="preserve"> to Static Web Apps only if every test passed</w:t>
+            </w:r>
+          </w:p>
+        </w:tc>
+        <w:tc>
+          <w:tcPr>
+            <w:tcW w:w="1489" w:type="dxa"/>
+            <w:tcBorders>
+              <w:top w:val="single" w:sz="4" w:space="0" w:color="D9D4C7"/>
+              <w:left w:val="single" w:sz="4" w:space="0" w:color="D9D4C7"/>
+              <w:bottom w:val="single" w:sz="4" w:space="0" w:color="D9D4C7"/>
+              <w:right w:val="single" w:sz="4" w:space="0" w:color="D9D4C7"/>
+            </w:tcBorders>
+            <w:tcMar>
+              <w:top w:w="70" w:type="dxa"/>
+              <w:left w:w="110" w:type="dxa"/>
+              <w:bottom w:w="70" w:type="dxa"/>
+              <w:right w:w="110" w:type="dxa"/>
+            </w:tcMar>
+          </w:tcPr>
+          <w:p>
+            <w:r>
+              <w:t>CD</w:t>
+            </w:r>
+          </w:p>
+        </w:tc>
+      </w:tr>
+      <w:tr>
+        <w:tc>
+          <w:tcPr>
+            <w:tcW w:w="1861" w:type="dxa"/>
+            <w:tcBorders>
+              <w:top w:val="single" w:sz="4" w:space="0" w:color="D9D4C7"/>
+              <w:left w:val="single" w:sz="4" w:space="0" w:color="D9D4C7"/>
+              <w:bottom w:val="single" w:sz="4" w:space="0" w:color="D9D4C7"/>
+              <w:right w:val="single" w:sz="4" w:space="0" w:color="D9D4C7"/>
+            </w:tcBorders>
+            <w:tcMar>
+              <w:top w:w="70" w:type="dxa"/>
+              <w:left w:w="110" w:type="dxa"/>
+              <w:bottom w:w="70" w:type="dxa"/>
+              <w:right w:w="110" w:type="dxa"/>
+            </w:tcMar>
+          </w:tcPr>
+          <w:p>
+            <w:r>
+              <w:rPr>
+                <w:rFonts w:ascii="Consolas" w:eastAsia="Consolas" w:hAnsi="Consolas" w:cs="Consolas"/>
+                <w:color w:val="5A3A0E"/>
+                <w:sz w:val="19"/>
+                <w:szCs w:val="19"/>
+              </w:rPr>
               <w:t>weekly-pipeline.yml</w:t>
             </w:r>
           </w:p>
@@ -2746,7 +2881,7 @@
         <w:keepNext/>
         <w:keepLines/>
       </w:pPr>
-      <w:bookmarkStart w:id="7" w:name="_Toc243757358"/>
+      <w:bookmarkStart w:id="7" w:name="_Toc243759553"/>
       <w:r>
         <w:t>How GitHub Actions workflows work</w:t>
       </w:r>
@@ -3050,7 +3185,19 @@
         <w:t>main</w:t>
       </w:r>
       <w:r>
-        <w:t xml:space="preserve"> starts Test, Deploy Backend and Deploy Frontend together, which is why deploys don't wait for tests (issue 13).</w:t>
+        <w:t xml:space="preserve"> starts Deploy Backend and Deploy Frontend together; to make each deploy wait for the tests, both call the Test workflow as their first job and the deploy job declares </w:t>
+      </w:r>
+      <w:r>
+        <w:rPr>
+          <w:rFonts w:ascii="Consolas" w:eastAsia="Consolas" w:hAnsi="Consolas" w:cs="Consolas"/>
+          <w:color w:val="5A3A0E"/>
+          <w:sz w:val="19"/>
+          <w:szCs w:val="19"/>
+        </w:rPr>
+        <w:t>needs: tests</w:t>
+      </w:r>
+      <w:r>
+        <w:t xml:space="preserve"> (issue 13).</w:t>
       </w:r>
     </w:p>
     <w:p>
@@ -3266,7 +3413,7 @@
         <w:keepNext/>
         <w:keepLines/>
       </w:pPr>
-      <w:bookmarkStart w:id="8" w:name="_Toc243757359"/>
+      <w:bookmarkStart w:id="8" w:name="_Toc243759554"/>
       <w:r>
         <w:t>How CI finds the tests</w:t>
       </w:r>
@@ -3883,7 +4030,7 @@
         <w:keepNext/>
         <w:keepLines/>
       </w:pPr>
-      <w:bookmarkStart w:id="9" w:name="_Toc243757360"/>
+      <w:bookmarkStart w:id="9" w:name="_Toc243759555"/>
       <w:r>
         <w:t>Example: adding a job to a workflow</w:t>
       </w:r>
@@ -3894,7 +4041,7 @@
         <w:spacing w:after="120"/>
       </w:pPr>
       <w:r>
-        <w:t>The frontend Jest tests already have their settings (</w:t>
+        <w:t>The frontend Jest tests had their settings (</w:t>
       </w:r>
       <w:r>
         <w:rPr>
@@ -3906,7 +4053,7 @@
         <w:t>frontend/jest.config.js</w:t>
       </w:r>
       <w:r>
-        <w:t xml:space="preserve">) but nothing runs them in CI. Running them automatically means adding a third job to </w:t>
+        <w:t xml:space="preserve">) but nothing ran them in CI. Running them automatically meant adding a third job to </w:t>
       </w:r>
       <w:r>
         <w:rPr>
@@ -3930,7 +4077,7 @@
         <w:t>unit-tests</w:t>
       </w:r>
       <w:r>
-        <w:t>:</w:t>
+        <w:t xml:space="preserve"> - this is the job now in the repository:</w:t>
       </w:r>
     </w:p>
     <w:p>
@@ -4205,7 +4352,19 @@
         <w:spacing w:after="120"/>
       </w:pPr>
       <w:r>
-        <w:t>The trigger at the top of the file applies to every job, so this runs on every PR and appears as a third check, "Test / frontend-tests".</w:t>
+        <w:t xml:space="preserve">The trigger at the top of the file applies to every job, so this runs on every PR and appears as a third check, "Test / frontend-tests". Before committing it, the three steps were run on a clean copy of the branch (fresh </w:t>
+      </w:r>
+      <w:r>
+        <w:rPr>
+          <w:rFonts w:ascii="Consolas" w:eastAsia="Consolas" w:hAnsi="Consolas" w:cs="Consolas"/>
+          <w:color w:val="5A3A0E"/>
+          <w:sz w:val="19"/>
+          <w:szCs w:val="19"/>
+        </w:rPr>
+        <w:t>npm ci</w:t>
+      </w:r>
+      <w:r>
+        <w:t>, 10 Jest tests, static build) to be sure the job would pass.</w:t>
       </w:r>
     </w:p>
     <w:p>
@@ -4219,7 +4378,7 @@
         <w:keepNext/>
         <w:keepLines/>
       </w:pPr>
-      <w:bookmarkStart w:id="10" w:name="_Toc243757361"/>
+      <w:bookmarkStart w:id="10" w:name="_Toc243759556"/>
       <w:r>
         <w:t>What the CI tests cover</w:t>
       </w:r>
@@ -4347,6 +4506,44 @@
           <w:b/>
           <w:bCs/>
         </w:rPr>
+        <w:t>Frontend tests (</w:t>
+      </w:r>
+      <w:r>
+        <w:rPr>
+          <w:rFonts w:ascii="Consolas" w:eastAsia="Consolas" w:hAnsi="Consolas" w:cs="Consolas"/>
+          <w:b/>
+          <w:bCs/>
+          <w:color w:val="5A3A0E"/>
+          <w:sz w:val="19"/>
+          <w:szCs w:val="19"/>
+        </w:rPr>
+        <w:t>frontend/__tests__/</w:t>
+      </w:r>
+      <w:r>
+        <w:rPr>
+          <w:b/>
+          <w:bCs/>
+        </w:rPr>
+        <w:t>, job frontend-tests):</w:t>
+      </w:r>
+      <w:r>
+        <w:t xml:space="preserve"> the chat box, answer formatting and sample questions, plus a check that the site builds as a static export.</w:t>
+      </w:r>
+    </w:p>
+    <w:p>
+      <w:pPr>
+        <w:pStyle w:val="ListParagraph"/>
+        <w:numPr>
+          <w:ilvl w:val="0"/>
+          <w:numId w:val="2"/>
+        </w:numPr>
+        <w:spacing w:after="60"/>
+      </w:pPr>
+      <w:r>
+        <w:rPr>
+          <w:b/>
+          <w:bCs/>
+        </w:rPr>
         <w:t>Not in CI:</w:t>
       </w:r>
       <w:r>
@@ -4362,7 +4559,7 @@
         <w:t>slow</w:t>
       </w:r>
       <w:r>
-        <w:t xml:space="preserve"> tests (real Claude/network calls), the frontend Jest tests, and any check that the website builds.</w:t>
+        <w:t xml:space="preserve"> tests (real Claude/network calls).</w:t>
       </w:r>
     </w:p>
     <w:p>
@@ -4376,7 +4573,7 @@
         <w:keepNext/>
         <w:keepLines/>
       </w:pPr>
-      <w:bookmarkStart w:id="11" w:name="_Toc243757362"/>
+      <w:bookmarkStart w:id="11" w:name="_Toc243759557"/>
       <w:r>
         <w:t>Part 3. The issues we hit, and what each one teaches</w:t>
       </w:r>
@@ -4396,7 +4593,7 @@
         <w:keepNext/>
         <w:keepLines/>
       </w:pPr>
-      <w:bookmarkStart w:id="12" w:name="_Toc243757363"/>
+      <w:bookmarkStart w:id="12" w:name="_Toc243759558"/>
       <w:r>
         <w:t>A. Branches and pull requests</w:t>
       </w:r>
@@ -5470,7 +5667,7 @@
         <w:keepNext/>
         <w:keepLines/>
       </w:pPr>
-      <w:bookmarkStart w:id="13" w:name="_Toc243757364"/>
+      <w:bookmarkStart w:id="13" w:name="_Toc243759559"/>
       <w:r>
         <w:t>B. CI failures: "it works on my machine"</w:t>
       </w:r>
@@ -7694,7 +7891,7 @@
         <w:keepNext/>
         <w:keepLines/>
       </w:pPr>
-      <w:bookmarkStart w:id="14" w:name="_Toc243757365"/>
+      <w:bookmarkStart w:id="14" w:name="_Toc243759560"/>
       <w:r>
         <w:t>C. Workflow and deployment set-up</w:t>
       </w:r>
@@ -7911,7 +8108,7 @@
         <w:keepLines/>
       </w:pPr>
       <w:r>
-        <w:t>13. Deploys don't wait for tests</w:t>
+        <w:t>13. Deploys don't wait for tests (resolved)</w:t>
       </w:r>
     </w:p>
     <w:p>
@@ -7992,7 +8189,103 @@
         <w:t>Fix.</w:t>
       </w:r>
       <w:r>
-        <w:t xml:space="preserve"> Not fixed yet (see Part 4).</w:t>
+        <w:t xml:space="preserve"> </w:t>
+      </w:r>
+      <w:r>
+        <w:rPr>
+          <w:rFonts w:ascii="Consolas" w:eastAsia="Consolas" w:hAnsi="Consolas" w:cs="Consolas"/>
+          <w:color w:val="5A3A0E"/>
+          <w:sz w:val="19"/>
+          <w:szCs w:val="19"/>
+        </w:rPr>
+        <w:t>test.yml</w:t>
+      </w:r>
+      <w:r>
+        <w:t xml:space="preserve"> became a reusable workflow (</w:t>
+      </w:r>
+      <w:r>
+        <w:rPr>
+          <w:rFonts w:ascii="Consolas" w:eastAsia="Consolas" w:hAnsi="Consolas" w:cs="Consolas"/>
+          <w:color w:val="5A3A0E"/>
+          <w:sz w:val="19"/>
+          <w:szCs w:val="19"/>
+        </w:rPr>
+        <w:t>on: workflow_call</w:t>
+      </w:r>
+      <w:r>
+        <w:t xml:space="preserve">). Each deploy workflow now has a </w:t>
+      </w:r>
+      <w:r>
+        <w:rPr>
+          <w:rFonts w:ascii="Consolas" w:eastAsia="Consolas" w:hAnsi="Consolas" w:cs="Consolas"/>
+          <w:color w:val="5A3A0E"/>
+          <w:sz w:val="19"/>
+          <w:szCs w:val="19"/>
+        </w:rPr>
+        <w:t>tests</w:t>
+      </w:r>
+      <w:r>
+        <w:t xml:space="preserve"> job (</w:t>
+      </w:r>
+      <w:r>
+        <w:rPr>
+          <w:rFonts w:ascii="Consolas" w:eastAsia="Consolas" w:hAnsi="Consolas" w:cs="Consolas"/>
+          <w:color w:val="5A3A0E"/>
+          <w:sz w:val="19"/>
+          <w:szCs w:val="19"/>
+        </w:rPr>
+        <w:t>uses: ./.github/workflows/test.yml</w:t>
+      </w:r>
+      <w:r>
+        <w:t xml:space="preserve">) and its </w:t>
+      </w:r>
+      <w:r>
+        <w:rPr>
+          <w:rFonts w:ascii="Consolas" w:eastAsia="Consolas" w:hAnsi="Consolas" w:cs="Consolas"/>
+          <w:color w:val="5A3A0E"/>
+          <w:sz w:val="19"/>
+          <w:szCs w:val="19"/>
+        </w:rPr>
+        <w:t>deploy</w:t>
+      </w:r>
+      <w:r>
+        <w:t xml:space="preserve"> job declares </w:t>
+      </w:r>
+      <w:r>
+        <w:rPr>
+          <w:rFonts w:ascii="Consolas" w:eastAsia="Consolas" w:hAnsi="Consolas" w:cs="Consolas"/>
+          <w:color w:val="5A3A0E"/>
+          <w:sz w:val="19"/>
+          <w:szCs w:val="19"/>
+        </w:rPr>
+        <w:t>needs: tests</w:t>
+      </w:r>
+      <w:r>
+        <w:t xml:space="preserve">, so it only starts when every test job passed. The path filters still apply, and </w:t>
+      </w:r>
+      <w:r>
+        <w:rPr>
+          <w:rFonts w:ascii="Consolas" w:eastAsia="Consolas" w:hAnsi="Consolas" w:cs="Consolas"/>
+          <w:color w:val="5A3A0E"/>
+          <w:sz w:val="19"/>
+          <w:szCs w:val="19"/>
+        </w:rPr>
+        <w:t>test.yml</w:t>
+      </w:r>
+      <w:r>
+        <w:t xml:space="preserve"> no longer has its own push-to-</w:t>
+      </w:r>
+      <w:r>
+        <w:rPr>
+          <w:rFonts w:ascii="Consolas" w:eastAsia="Consolas" w:hAnsi="Consolas" w:cs="Consolas"/>
+          <w:color w:val="5A3A0E"/>
+          <w:sz w:val="19"/>
+          <w:szCs w:val="19"/>
+        </w:rPr>
+        <w:t>main</w:t>
+      </w:r>
+      <w:r>
+        <w:t xml:space="preserve"> trigger, so tests don't run twice.</w:t>
       </w:r>
     </w:p>
     <w:tbl>
@@ -8336,7 +8629,7 @@
         <w:keepNext/>
         <w:keepLines/>
       </w:pPr>
-      <w:bookmarkStart w:id="15" w:name="_Toc243757366"/>
+      <w:bookmarkStart w:id="15" w:name="_Toc243759561"/>
       <w:r>
         <w:t>Part 4. The release, step by step</w:t>
       </w:r>
@@ -9215,6 +9508,74 @@
           </w:p>
         </w:tc>
       </w:tr>
+      <w:tr>
+        <w:tc>
+          <w:tcPr>
+            <w:tcW w:w="651" w:type="dxa"/>
+            <w:tcBorders>
+              <w:top w:val="single" w:sz="4" w:space="0" w:color="D9D4C7"/>
+              <w:left w:val="single" w:sz="4" w:space="0" w:color="D9D4C7"/>
+              <w:bottom w:val="single" w:sz="4" w:space="0" w:color="D9D4C7"/>
+              <w:right w:val="single" w:sz="4" w:space="0" w:color="D9D4C7"/>
+            </w:tcBorders>
+            <w:tcMar>
+              <w:top w:w="70" w:type="dxa"/>
+              <w:left w:w="110" w:type="dxa"/>
+              <w:bottom w:w="70" w:type="dxa"/>
+              <w:right w:w="110" w:type="dxa"/>
+            </w:tcMar>
+          </w:tcPr>
+          <w:p>
+            <w:r>
+              <w:t>9</w:t>
+            </w:r>
+          </w:p>
+        </w:tc>
+        <w:tc>
+          <w:tcPr>
+            <w:tcW w:w="4932" w:type="dxa"/>
+            <w:tcBorders>
+              <w:top w:val="single" w:sz="4" w:space="0" w:color="D9D4C7"/>
+              <w:left w:val="single" w:sz="4" w:space="0" w:color="D9D4C7"/>
+              <w:bottom w:val="single" w:sz="4" w:space="0" w:color="D9D4C7"/>
+              <w:right w:val="single" w:sz="4" w:space="0" w:color="D9D4C7"/>
+            </w:tcBorders>
+            <w:tcMar>
+              <w:top w:w="70" w:type="dxa"/>
+              <w:left w:w="110" w:type="dxa"/>
+              <w:bottom w:w="70" w:type="dxa"/>
+              <w:right w:w="110" w:type="dxa"/>
+            </w:tcMar>
+          </w:tcPr>
+          <w:p>
+            <w:r>
+              <w:t>Pinned the Supabase CLI, added the frontend-tests job, made deploys wait for tests</w:t>
+            </w:r>
+          </w:p>
+        </w:tc>
+        <w:tc>
+          <w:tcPr>
+            <w:tcW w:w="3723" w:type="dxa"/>
+            <w:tcBorders>
+              <w:top w:val="single" w:sz="4" w:space="0" w:color="D9D4C7"/>
+              <w:left w:val="single" w:sz="4" w:space="0" w:color="D9D4C7"/>
+              <w:bottom w:val="single" w:sz="4" w:space="0" w:color="D9D4C7"/>
+              <w:right w:val="single" w:sz="4" w:space="0" w:color="D9D4C7"/>
+            </w:tcBorders>
+            <w:tcMar>
+              <w:top w:w="70" w:type="dxa"/>
+              <w:left w:w="110" w:type="dxa"/>
+              <w:bottom w:w="70" w:type="dxa"/>
+              <w:right w:w="110" w:type="dxa"/>
+            </w:tcMar>
+          </w:tcPr>
+          <w:p>
+            <w:r>
+              <w:t>Every PR runs three test jobs; every deploy runs them first and stops if any fail</w:t>
+            </w:r>
+          </w:p>
+        </w:tc>
+      </w:tr>
     </w:tbl>
     <w:p>
       <w:pPr>
@@ -9306,7 +9667,7 @@
         <w:keepNext/>
         <w:keepLines/>
       </w:pPr>
-      <w:bookmarkStart w:id="16" w:name="_Toc243757367"/>
+      <w:bookmarkStart w:id="16" w:name="_Toc243759562"/>
       <w:r>
         <w:t>Part 5. Remaining gaps, in priority order</w:t>
       </w:r>
@@ -9519,7 +9880,7 @@
               <w:t>unit-tests</w:t>
             </w:r>
             <w:r>
-              <w:t xml:space="preserve"> and </w:t>
+              <w:t xml:space="preserve">, </w:t>
             </w:r>
             <w:r>
               <w:rPr>
@@ -9529,6 +9890,16 @@
               <w:t>integration-tests</w:t>
             </w:r>
             <w:r>
+              <w:t xml:space="preserve"> and </w:t>
+            </w:r>
+            <w:r>
+              <w:rPr>
+                <w:b/>
+                <w:bCs/>
+              </w:rPr>
+              <w:t>frontend-tests</w:t>
+            </w:r>
+            <w:r>
               <w:t xml:space="preserve"> to pass before merging</w:t>
             </w:r>
           </w:p>
@@ -9551,7 +9922,7 @@
           </w:tcPr>
           <w:p>
             <w:r>
-              <w:t>Both checks are now reliably green, so a red PR should be blocked rather than merged by accident</w:t>
+              <w:t>All three checks are now reliably green, so a red PR should be blocked rather than merged by accident (deploys are already gated)</w:t>
             </w:r>
           </w:p>
         </w:tc>
@@ -9619,7 +9990,119 @@
           </w:tcPr>
           <w:p>
             <w:r>
-              <w:t xml:space="preserve">Pin the Supabase CLI version in </w:t>
+              <w:t>Preview sites for PRs (Azure Static Web Apps)</w:t>
+            </w:r>
+          </w:p>
+        </w:tc>
+        <w:tc>
+          <w:tcPr>
+            <w:tcW w:w="3536" w:type="dxa"/>
+            <w:tcBorders>
+              <w:top w:val="single" w:sz="4" w:space="0" w:color="D9D4C7"/>
+              <w:left w:val="single" w:sz="4" w:space="0" w:color="D9D4C7"/>
+              <w:bottom w:val="single" w:sz="4" w:space="0" w:color="D9D4C7"/>
+              <w:right w:val="single" w:sz="4" w:space="0" w:color="D9D4C7"/>
+            </w:tcBorders>
+            <w:tcMar>
+              <w:top w:w="70" w:type="dxa"/>
+              <w:left w:w="110" w:type="dxa"/>
+              <w:bottom w:w="70" w:type="dxa"/>
+              <w:right w:w="110" w:type="dxa"/>
+            </w:tcMar>
+          </w:tcPr>
+          <w:p>
+            <w:r>
+              <w:t>Check UI changes on a real URL before production</w:t>
+            </w:r>
+          </w:p>
+        </w:tc>
+        <w:tc>
+          <w:tcPr>
+            <w:tcW w:w="1862" w:type="dxa"/>
+            <w:tcBorders>
+              <w:top w:val="single" w:sz="4" w:space="0" w:color="D9D4C7"/>
+              <w:left w:val="single" w:sz="4" w:space="0" w:color="D9D4C7"/>
+              <w:bottom w:val="single" w:sz="4" w:space="0" w:color="D9D4C7"/>
+              <w:right w:val="single" w:sz="4" w:space="0" w:color="D9D4C7"/>
+            </w:tcBorders>
+            <w:tcMar>
+              <w:top w:w="70" w:type="dxa"/>
+              <w:left w:w="110" w:type="dxa"/>
+              <w:bottom w:w="70" w:type="dxa"/>
+              <w:right w:w="110" w:type="dxa"/>
+            </w:tcMar>
+          </w:tcPr>
+          <w:p>
+            <w:r>
+              <w:t>Workflow change + CORS update</w:t>
+            </w:r>
+          </w:p>
+        </w:tc>
+      </w:tr>
+      <w:tr>
+        <w:tc>
+          <w:tcPr>
+            <w:tcW w:w="465" w:type="dxa"/>
+            <w:tcBorders>
+              <w:top w:val="single" w:sz="4" w:space="0" w:color="D9D4C7"/>
+              <w:left w:val="single" w:sz="4" w:space="0" w:color="D9D4C7"/>
+              <w:bottom w:val="single" w:sz="4" w:space="0" w:color="D9D4C7"/>
+              <w:right w:val="single" w:sz="4" w:space="0" w:color="D9D4C7"/>
+            </w:tcBorders>
+            <w:tcMar>
+              <w:top w:w="70" w:type="dxa"/>
+              <w:left w:w="110" w:type="dxa"/>
+              <w:bottom w:w="70" w:type="dxa"/>
+              <w:right w:w="110" w:type="dxa"/>
+            </w:tcMar>
+          </w:tcPr>
+          <w:p>
+            <w:r>
+              <w:t>3</w:t>
+            </w:r>
+          </w:p>
+        </w:tc>
+        <w:tc>
+          <w:tcPr>
+            <w:tcW w:w="3443" w:type="dxa"/>
+            <w:tcBorders>
+              <w:top w:val="single" w:sz="4" w:space="0" w:color="D9D4C7"/>
+              <w:left w:val="single" w:sz="4" w:space="0" w:color="D9D4C7"/>
+              <w:bottom w:val="single" w:sz="4" w:space="0" w:color="D9D4C7"/>
+              <w:right w:val="single" w:sz="4" w:space="0" w:color="D9D4C7"/>
+            </w:tcBorders>
+            <w:tcMar>
+              <w:top w:w="70" w:type="dxa"/>
+              <w:left w:w="110" w:type="dxa"/>
+              <w:bottom w:w="70" w:type="dxa"/>
+              <w:right w:w="110" w:type="dxa"/>
+            </w:tcMar>
+          </w:tcPr>
+          <w:p>
+            <w:r>
+              <w:t>A staging environment (backend + test database)</w:t>
+            </w:r>
+          </w:p>
+        </w:tc>
+        <w:tc>
+          <w:tcPr>
+            <w:tcW w:w="3536" w:type="dxa"/>
+            <w:tcBorders>
+              <w:top w:val="single" w:sz="4" w:space="0" w:color="D9D4C7"/>
+              <w:left w:val="single" w:sz="4" w:space="0" w:color="D9D4C7"/>
+              <w:bottom w:val="single" w:sz="4" w:space="0" w:color="D9D4C7"/>
+              <w:right w:val="single" w:sz="4" w:space="0" w:color="D9D4C7"/>
+            </w:tcBorders>
+            <w:tcMar>
+              <w:top w:w="70" w:type="dxa"/>
+              <w:left w:w="110" w:type="dxa"/>
+              <w:bottom w:w="70" w:type="dxa"/>
+              <w:right w:w="110" w:type="dxa"/>
+            </w:tcMar>
+          </w:tcPr>
+          <w:p>
+            <w:r>
+              <w:t xml:space="preserve">Test </w:t>
             </w:r>
             <w:r>
               <w:rPr>
@@ -9628,41 +10111,10 @@
                 <w:sz w:val="19"/>
                 <w:szCs w:val="19"/>
               </w:rPr>
-              <w:t>test.yml</w:t>
-            </w:r>
-            <w:r>
-              <w:t xml:space="preserve"> instead of </w:t>
-            </w:r>
-            <w:r>
-              <w:rPr>
-                <w:rFonts w:ascii="Consolas" w:eastAsia="Consolas" w:hAnsi="Consolas" w:cs="Consolas"/>
-                <w:color w:val="5A3A0E"/>
-                <w:sz w:val="19"/>
-                <w:szCs w:val="19"/>
-              </w:rPr>
-              <w:t>version: latest</w:t>
-            </w:r>
-          </w:p>
-        </w:tc>
-        <w:tc>
-          <w:tcPr>
-            <w:tcW w:w="3536" w:type="dxa"/>
-            <w:tcBorders>
-              <w:top w:val="single" w:sz="4" w:space="0" w:color="D9D4C7"/>
-              <w:left w:val="single" w:sz="4" w:space="0" w:color="D9D4C7"/>
-              <w:bottom w:val="single" w:sz="4" w:space="0" w:color="D9D4C7"/>
-              <w:right w:val="single" w:sz="4" w:space="0" w:color="D9D4C7"/>
-            </w:tcBorders>
-            <w:tcMar>
-              <w:top w:w="70" w:type="dxa"/>
-              <w:left w:w="110" w:type="dxa"/>
-              <w:bottom w:w="70" w:type="dxa"/>
-              <w:right w:w="110" w:type="dxa"/>
-            </w:tcMar>
-          </w:tcPr>
-          <w:p>
-            <w:r>
-              <w:t>A new CLI release can change behaviour (as the env output format did) and break CI with no code change</w:t>
+              <w:t>dev</w:t>
+            </w:r>
+            <w:r>
+              <w:t xml:space="preserve"> end-to-end without touching live data</w:t>
             </w:r>
           </w:p>
         </w:tc>
@@ -9684,7 +10136,7 @@
           </w:tcPr>
           <w:p>
             <w:r>
-              <w:t>One line</w:t>
+              <w:t>More set-up and some cost</w:t>
             </w:r>
           </w:p>
         </w:tc>
@@ -9708,391 +10160,7 @@
           </w:tcPr>
           <w:p>
             <w:r>
-              <w:t>3</w:t>
-            </w:r>
-          </w:p>
-        </w:tc>
-        <w:tc>
-          <w:tcPr>
-            <w:tcW w:w="3443" w:type="dxa"/>
-            <w:tcBorders>
-              <w:top w:val="single" w:sz="4" w:space="0" w:color="D9D4C7"/>
-              <w:left w:val="single" w:sz="4" w:space="0" w:color="D9D4C7"/>
-              <w:bottom w:val="single" w:sz="4" w:space="0" w:color="D9D4C7"/>
-              <w:right w:val="single" w:sz="4" w:space="0" w:color="D9D4C7"/>
-            </w:tcBorders>
-            <w:tcMar>
-              <w:top w:w="70" w:type="dxa"/>
-              <w:left w:w="110" w:type="dxa"/>
-              <w:bottom w:w="70" w:type="dxa"/>
-              <w:right w:w="110" w:type="dxa"/>
-            </w:tcMar>
-          </w:tcPr>
-          <w:p>
-            <w:r>
-              <w:t>Make deploys depend on tests</w:t>
-            </w:r>
-          </w:p>
-        </w:tc>
-        <w:tc>
-          <w:tcPr>
-            <w:tcW w:w="3536" w:type="dxa"/>
-            <w:tcBorders>
-              <w:top w:val="single" w:sz="4" w:space="0" w:color="D9D4C7"/>
-              <w:left w:val="single" w:sz="4" w:space="0" w:color="D9D4C7"/>
-              <w:bottom w:val="single" w:sz="4" w:space="0" w:color="D9D4C7"/>
-              <w:right w:val="single" w:sz="4" w:space="0" w:color="D9D4C7"/>
-            </w:tcBorders>
-            <w:tcMar>
-              <w:top w:w="70" w:type="dxa"/>
-              <w:left w:w="110" w:type="dxa"/>
-              <w:bottom w:w="70" w:type="dxa"/>
-              <w:right w:w="110" w:type="dxa"/>
-            </w:tcMar>
-          </w:tcPr>
-          <w:p>
-            <w:r>
-              <w:t>Today a commit with failing tests still deploys</w:t>
-            </w:r>
-          </w:p>
-        </w:tc>
-        <w:tc>
-          <w:tcPr>
-            <w:tcW w:w="1862" w:type="dxa"/>
-            <w:tcBorders>
-              <w:top w:val="single" w:sz="4" w:space="0" w:color="D9D4C7"/>
-              <w:left w:val="single" w:sz="4" w:space="0" w:color="D9D4C7"/>
-              <w:bottom w:val="single" w:sz="4" w:space="0" w:color="D9D4C7"/>
-              <w:right w:val="single" w:sz="4" w:space="0" w:color="D9D4C7"/>
-            </w:tcBorders>
-            <w:tcMar>
-              <w:top w:w="70" w:type="dxa"/>
-              <w:left w:w="110" w:type="dxa"/>
-              <w:bottom w:w="70" w:type="dxa"/>
-              <w:right w:w="110" w:type="dxa"/>
-            </w:tcMar>
-          </w:tcPr>
-          <w:p>
-            <w:r>
-              <w:t>Small workflow change</w:t>
-            </w:r>
-          </w:p>
-        </w:tc>
-      </w:tr>
-      <w:tr>
-        <w:tc>
-          <w:tcPr>
-            <w:tcW w:w="465" w:type="dxa"/>
-            <w:tcBorders>
-              <w:top w:val="single" w:sz="4" w:space="0" w:color="D9D4C7"/>
-              <w:left w:val="single" w:sz="4" w:space="0" w:color="D9D4C7"/>
-              <w:bottom w:val="single" w:sz="4" w:space="0" w:color="D9D4C7"/>
-              <w:right w:val="single" w:sz="4" w:space="0" w:color="D9D4C7"/>
-            </w:tcBorders>
-            <w:tcMar>
-              <w:top w:w="70" w:type="dxa"/>
-              <w:left w:w="110" w:type="dxa"/>
-              <w:bottom w:w="70" w:type="dxa"/>
-              <w:right w:w="110" w:type="dxa"/>
-            </w:tcMar>
-          </w:tcPr>
-          <w:p>
-            <w:r>
               <w:t>4</w:t>
-            </w:r>
-          </w:p>
-        </w:tc>
-        <w:tc>
-          <w:tcPr>
-            <w:tcW w:w="3443" w:type="dxa"/>
-            <w:tcBorders>
-              <w:top w:val="single" w:sz="4" w:space="0" w:color="D9D4C7"/>
-              <w:left w:val="single" w:sz="4" w:space="0" w:color="D9D4C7"/>
-              <w:bottom w:val="single" w:sz="4" w:space="0" w:color="D9D4C7"/>
-              <w:right w:val="single" w:sz="4" w:space="0" w:color="D9D4C7"/>
-            </w:tcBorders>
-            <w:tcMar>
-              <w:top w:w="70" w:type="dxa"/>
-              <w:left w:w="110" w:type="dxa"/>
-              <w:bottom w:w="70" w:type="dxa"/>
-              <w:right w:w="110" w:type="dxa"/>
-            </w:tcMar>
-          </w:tcPr>
-          <w:p>
-            <w:r>
-              <w:t xml:space="preserve">Add the frontend Jest tests and a </w:t>
-            </w:r>
-            <w:r>
-              <w:rPr>
-                <w:rFonts w:ascii="Consolas" w:eastAsia="Consolas" w:hAnsi="Consolas" w:cs="Consolas"/>
-                <w:color w:val="5A3A0E"/>
-                <w:sz w:val="19"/>
-                <w:szCs w:val="19"/>
-              </w:rPr>
-              <w:t>next build</w:t>
-            </w:r>
-            <w:r>
-              <w:t xml:space="preserve"> check to CI</w:t>
-            </w:r>
-          </w:p>
-        </w:tc>
-        <w:tc>
-          <w:tcPr>
-            <w:tcW w:w="3536" w:type="dxa"/>
-            <w:tcBorders>
-              <w:top w:val="single" w:sz="4" w:space="0" w:color="D9D4C7"/>
-              <w:left w:val="single" w:sz="4" w:space="0" w:color="D9D4C7"/>
-              <w:bottom w:val="single" w:sz="4" w:space="0" w:color="D9D4C7"/>
-              <w:right w:val="single" w:sz="4" w:space="0" w:color="D9D4C7"/>
-            </w:tcBorders>
-            <w:tcMar>
-              <w:top w:w="70" w:type="dxa"/>
-              <w:left w:w="110" w:type="dxa"/>
-              <w:bottom w:w="70" w:type="dxa"/>
-              <w:right w:w="110" w:type="dxa"/>
-            </w:tcMar>
-          </w:tcPr>
-          <w:p>
-            <w:r>
-              <w:t>UI and build problems are invisible to CI today</w:t>
-            </w:r>
-          </w:p>
-        </w:tc>
-        <w:tc>
-          <w:tcPr>
-            <w:tcW w:w="1862" w:type="dxa"/>
-            <w:tcBorders>
-              <w:top w:val="single" w:sz="4" w:space="0" w:color="D9D4C7"/>
-              <w:left w:val="single" w:sz="4" w:space="0" w:color="D9D4C7"/>
-              <w:bottom w:val="single" w:sz="4" w:space="0" w:color="D9D4C7"/>
-              <w:right w:val="single" w:sz="4" w:space="0" w:color="D9D4C7"/>
-            </w:tcBorders>
-            <w:tcMar>
-              <w:top w:w="70" w:type="dxa"/>
-              <w:left w:w="110" w:type="dxa"/>
-              <w:bottom w:w="70" w:type="dxa"/>
-              <w:right w:w="110" w:type="dxa"/>
-            </w:tcMar>
-          </w:tcPr>
-          <w:p>
-            <w:r>
-              <w:t>About 15 lines of YAML</w:t>
-            </w:r>
-          </w:p>
-        </w:tc>
-      </w:tr>
-      <w:tr>
-        <w:tc>
-          <w:tcPr>
-            <w:tcW w:w="465" w:type="dxa"/>
-            <w:tcBorders>
-              <w:top w:val="single" w:sz="4" w:space="0" w:color="D9D4C7"/>
-              <w:left w:val="single" w:sz="4" w:space="0" w:color="D9D4C7"/>
-              <w:bottom w:val="single" w:sz="4" w:space="0" w:color="D9D4C7"/>
-              <w:right w:val="single" w:sz="4" w:space="0" w:color="D9D4C7"/>
-            </w:tcBorders>
-            <w:tcMar>
-              <w:top w:w="70" w:type="dxa"/>
-              <w:left w:w="110" w:type="dxa"/>
-              <w:bottom w:w="70" w:type="dxa"/>
-              <w:right w:w="110" w:type="dxa"/>
-            </w:tcMar>
-          </w:tcPr>
-          <w:p>
-            <w:r>
-              <w:t>5</w:t>
-            </w:r>
-          </w:p>
-        </w:tc>
-        <w:tc>
-          <w:tcPr>
-            <w:tcW w:w="3443" w:type="dxa"/>
-            <w:tcBorders>
-              <w:top w:val="single" w:sz="4" w:space="0" w:color="D9D4C7"/>
-              <w:left w:val="single" w:sz="4" w:space="0" w:color="D9D4C7"/>
-              <w:bottom w:val="single" w:sz="4" w:space="0" w:color="D9D4C7"/>
-              <w:right w:val="single" w:sz="4" w:space="0" w:color="D9D4C7"/>
-            </w:tcBorders>
-            <w:tcMar>
-              <w:top w:w="70" w:type="dxa"/>
-              <w:left w:w="110" w:type="dxa"/>
-              <w:bottom w:w="70" w:type="dxa"/>
-              <w:right w:w="110" w:type="dxa"/>
-            </w:tcMar>
-          </w:tcPr>
-          <w:p>
-            <w:r>
-              <w:t>Preview sites for PRs (Azure Static Web Apps)</w:t>
-            </w:r>
-          </w:p>
-        </w:tc>
-        <w:tc>
-          <w:tcPr>
-            <w:tcW w:w="3536" w:type="dxa"/>
-            <w:tcBorders>
-              <w:top w:val="single" w:sz="4" w:space="0" w:color="D9D4C7"/>
-              <w:left w:val="single" w:sz="4" w:space="0" w:color="D9D4C7"/>
-              <w:bottom w:val="single" w:sz="4" w:space="0" w:color="D9D4C7"/>
-              <w:right w:val="single" w:sz="4" w:space="0" w:color="D9D4C7"/>
-            </w:tcBorders>
-            <w:tcMar>
-              <w:top w:w="70" w:type="dxa"/>
-              <w:left w:w="110" w:type="dxa"/>
-              <w:bottom w:w="70" w:type="dxa"/>
-              <w:right w:w="110" w:type="dxa"/>
-            </w:tcMar>
-          </w:tcPr>
-          <w:p>
-            <w:r>
-              <w:t>Check UI changes on a real URL before production</w:t>
-            </w:r>
-          </w:p>
-        </w:tc>
-        <w:tc>
-          <w:tcPr>
-            <w:tcW w:w="1862" w:type="dxa"/>
-            <w:tcBorders>
-              <w:top w:val="single" w:sz="4" w:space="0" w:color="D9D4C7"/>
-              <w:left w:val="single" w:sz="4" w:space="0" w:color="D9D4C7"/>
-              <w:bottom w:val="single" w:sz="4" w:space="0" w:color="D9D4C7"/>
-              <w:right w:val="single" w:sz="4" w:space="0" w:color="D9D4C7"/>
-            </w:tcBorders>
-            <w:tcMar>
-              <w:top w:w="70" w:type="dxa"/>
-              <w:left w:w="110" w:type="dxa"/>
-              <w:bottom w:w="70" w:type="dxa"/>
-              <w:right w:w="110" w:type="dxa"/>
-            </w:tcMar>
-          </w:tcPr>
-          <w:p>
-            <w:r>
-              <w:t>Workflow change + CORS update</w:t>
-            </w:r>
-          </w:p>
-        </w:tc>
-      </w:tr>
-      <w:tr>
-        <w:tc>
-          <w:tcPr>
-            <w:tcW w:w="465" w:type="dxa"/>
-            <w:tcBorders>
-              <w:top w:val="single" w:sz="4" w:space="0" w:color="D9D4C7"/>
-              <w:left w:val="single" w:sz="4" w:space="0" w:color="D9D4C7"/>
-              <w:bottom w:val="single" w:sz="4" w:space="0" w:color="D9D4C7"/>
-              <w:right w:val="single" w:sz="4" w:space="0" w:color="D9D4C7"/>
-            </w:tcBorders>
-            <w:tcMar>
-              <w:top w:w="70" w:type="dxa"/>
-              <w:left w:w="110" w:type="dxa"/>
-              <w:bottom w:w="70" w:type="dxa"/>
-              <w:right w:w="110" w:type="dxa"/>
-            </w:tcMar>
-          </w:tcPr>
-          <w:p>
-            <w:r>
-              <w:t>6</w:t>
-            </w:r>
-          </w:p>
-        </w:tc>
-        <w:tc>
-          <w:tcPr>
-            <w:tcW w:w="3443" w:type="dxa"/>
-            <w:tcBorders>
-              <w:top w:val="single" w:sz="4" w:space="0" w:color="D9D4C7"/>
-              <w:left w:val="single" w:sz="4" w:space="0" w:color="D9D4C7"/>
-              <w:bottom w:val="single" w:sz="4" w:space="0" w:color="D9D4C7"/>
-              <w:right w:val="single" w:sz="4" w:space="0" w:color="D9D4C7"/>
-            </w:tcBorders>
-            <w:tcMar>
-              <w:top w:w="70" w:type="dxa"/>
-              <w:left w:w="110" w:type="dxa"/>
-              <w:bottom w:w="70" w:type="dxa"/>
-              <w:right w:w="110" w:type="dxa"/>
-            </w:tcMar>
-          </w:tcPr>
-          <w:p>
-            <w:r>
-              <w:t>A staging environment (backend + test database)</w:t>
-            </w:r>
-          </w:p>
-        </w:tc>
-        <w:tc>
-          <w:tcPr>
-            <w:tcW w:w="3536" w:type="dxa"/>
-            <w:tcBorders>
-              <w:top w:val="single" w:sz="4" w:space="0" w:color="D9D4C7"/>
-              <w:left w:val="single" w:sz="4" w:space="0" w:color="D9D4C7"/>
-              <w:bottom w:val="single" w:sz="4" w:space="0" w:color="D9D4C7"/>
-              <w:right w:val="single" w:sz="4" w:space="0" w:color="D9D4C7"/>
-            </w:tcBorders>
-            <w:tcMar>
-              <w:top w:w="70" w:type="dxa"/>
-              <w:left w:w="110" w:type="dxa"/>
-              <w:bottom w:w="70" w:type="dxa"/>
-              <w:right w:w="110" w:type="dxa"/>
-            </w:tcMar>
-          </w:tcPr>
-          <w:p>
-            <w:r>
-              <w:t xml:space="preserve">Test </w:t>
-            </w:r>
-            <w:r>
-              <w:rPr>
-                <w:rFonts w:ascii="Consolas" w:eastAsia="Consolas" w:hAnsi="Consolas" w:cs="Consolas"/>
-                <w:color w:val="5A3A0E"/>
-                <w:sz w:val="19"/>
-                <w:szCs w:val="19"/>
-              </w:rPr>
-              <w:t>dev</w:t>
-            </w:r>
-            <w:r>
-              <w:t xml:space="preserve"> end-to-end without touching live data</w:t>
-            </w:r>
-          </w:p>
-        </w:tc>
-        <w:tc>
-          <w:tcPr>
-            <w:tcW w:w="1862" w:type="dxa"/>
-            <w:tcBorders>
-              <w:top w:val="single" w:sz="4" w:space="0" w:color="D9D4C7"/>
-              <w:left w:val="single" w:sz="4" w:space="0" w:color="D9D4C7"/>
-              <w:bottom w:val="single" w:sz="4" w:space="0" w:color="D9D4C7"/>
-              <w:right w:val="single" w:sz="4" w:space="0" w:color="D9D4C7"/>
-            </w:tcBorders>
-            <w:tcMar>
-              <w:top w:w="70" w:type="dxa"/>
-              <w:left w:w="110" w:type="dxa"/>
-              <w:bottom w:w="70" w:type="dxa"/>
-              <w:right w:w="110" w:type="dxa"/>
-            </w:tcMar>
-          </w:tcPr>
-          <w:p>
-            <w:r>
-              <w:t>More set-up and some cost</w:t>
-            </w:r>
-          </w:p>
-        </w:tc>
-      </w:tr>
-      <w:tr>
-        <w:tc>
-          <w:tcPr>
-            <w:tcW w:w="465" w:type="dxa"/>
-            <w:tcBorders>
-              <w:top w:val="single" w:sz="4" w:space="0" w:color="D9D4C7"/>
-              <w:left w:val="single" w:sz="4" w:space="0" w:color="D9D4C7"/>
-              <w:bottom w:val="single" w:sz="4" w:space="0" w:color="D9D4C7"/>
-              <w:right w:val="single" w:sz="4" w:space="0" w:color="D9D4C7"/>
-            </w:tcBorders>
-            <w:tcMar>
-              <w:top w:w="70" w:type="dxa"/>
-              <w:left w:w="110" w:type="dxa"/>
-              <w:bottom w:w="70" w:type="dxa"/>
-              <w:right w:w="110" w:type="dxa"/>
-            </w:tcMar>
-          </w:tcPr>
-          <w:p>
-            <w:r>
-              <w:t>7</w:t>
             </w:r>
           </w:p>
         </w:tc>
@@ -10175,7 +10243,7 @@
         <w:keepNext/>
         <w:keepLines/>
       </w:pPr>
-      <w:bookmarkStart w:id="17" w:name="_Toc243757368"/>
+      <w:bookmarkStart w:id="17" w:name="_Toc243759563"/>
       <w:r>
         <w:t>Pre-release checklist (until the gaps are closed)</w:t>
       </w:r>
@@ -10340,7 +10408,7 @@
         <w:keepNext/>
         <w:keepLines/>
       </w:pPr>
-      <w:bookmarkStart w:id="18" w:name="_Toc243757369"/>
+      <w:bookmarkStart w:id="18" w:name="_Toc243759564"/>
       <w:r>
         <w:t>Glossary</w:t>
       </w:r>
@@ -11122,7 +11190,7 @@
         <w:keepNext/>
         <w:keepLines/>
       </w:pPr>
-      <w:bookmarkStart w:id="19" w:name="_Toc243757370"/>
+      <w:bookmarkStart w:id="19" w:name="_Toc243759565"/>
       <w:r>
         <w:t>Command cheat sheet</w:t>
       </w:r>
@@ -11599,211 +11667,211 @@
 <file path=word/numbering.xml><?xml version="1.0" encoding="utf-8"?>
 <w:numbering xmlns:wpc="http://schemas.microsoft.com/office/word/2010/wordprocessingCanvas" xmlns:cx="http://schemas.microsoft.com/office/drawing/2014/chartex" xmlns:cx1="http://schemas.microsoft.com/office/drawing/2015/9/8/chartex" xmlns:cx2="http://schemas.microsoft.com/office/drawing/2015/10/21/chartex" xmlns:cx3="http://schemas.microsoft.com/office/drawing/2016/5/9/chartex" xmlns:cx4="http://schemas.microsoft.com/office/drawing/2016/5/10/chartex" xmlns:cx5="http://schemas.microsoft.com/office/drawing/2016/5/11/chartex" xmlns:cx6="http://schemas.microsoft.com/office/drawing/2016/5/12/chartex" xmlns:cx7="http://schemas.microsoft.com/office/drawing/2016/5/13/chartex" xmlns:cx8="http://schemas.microsoft.com/office/drawing/2016/5/14/chartex" xmlns:mc="http://schemas.openxmlformats.org/markup-compatibility/2006" xmlns:aink="http://schemas.microsoft.com/office/drawing/2016/ink" xmlns:am3d="http://schemas.microsoft.com/office/drawing/2017/model3d" xmlns:o="urn:schemas-microsoft-com:office:office" xmlns:oel="http://schemas.microsoft.com/office/2019/extlst" xmlns:r="http://schemas.openxmlformats.org/officeDocument/2006/relationships" xmlns:m="http://schemas.openxmlformats.org/officeDocument/2006/math" xmlns:v="urn:schemas-microsoft-com:vml" xmlns:wp14="http://schemas.microsoft.com/office/word/2010/wordprocessingDrawing" xmlns:wp="http://schemas.openxmlformats.org/drawingml/2006/wordprocessingDrawing" xmlns:w10="urn:schemas-microsoft-com:office:word" xmlns:w="http://schemas.openxmlformats.org/wordprocessingml/2006/main" xmlns:w14="http://schemas.microsoft.com/office/word/2010/wordml" xmlns:w15="http://schemas.microsoft.com/office/word/2012/wordml" xmlns:w16cex="http://schemas.microsoft.com/office/word/2018/wordml/cex" xmlns:w16cid="http://schemas.microsoft.com/office/word/2016/wordml/cid" xmlns:w16="http://schemas.microsoft.com/office/word/2018/wordml" xmlns:w16du="http://schemas.microsoft.com/office/word/2023/wordml/word16du" xmlns:w16sdtdh="http://schemas.microsoft.com/office/word/2020/wordml/sdtdatahash" xmlns:w16sdtfl="http://schemas.microsoft.com/office/word/2024/wordml/sdtformatlock" xmlns:w16se="http://schemas.microsoft.com/office/word/2015/wordml/symex" xmlns:wpg="http://schemas.microsoft.com/office/word/2010/wordprocessingGroup" xmlns:wpi="http://schemas.microsoft.com/office/word/2010/wordprocessingInk" xmlns:wne="http://schemas.microsoft.com/office/word/2006/wordml" xmlns:wps="http://schemas.microsoft.com/office/word/2010/wordprocessingShape" mc:Ignorable="w14 w15 w16se w16cid w16 w16cex w16sdtdh w16sdtfl w16du wp14">
   <w:abstractNum w:abstractNumId="0" w15:restartNumberingAfterBreak="0">
-    <w:nsid w:val="0B0C6D81"/>
+    <w:nsid w:val="143024EF"/>
     <w:multiLevelType w:val="hybridMultilevel"/>
-    <w:tmpl w:val="8DCC6308"/>
-    <w:lvl w:ilvl="0" w:tplc="AD66CFCA" w:tentative="1">
+    <w:tmpl w:val="2C10C85A"/>
+    <w:lvl w:ilvl="0" w:tplc="DB804D7A">
       <w:start w:val="1"/>
-      <w:numFmt w:val="bullet"/>
-      <w:lvlText w:val="●"/>
+      <w:numFmt w:val="decimal"/>
+      <w:lvlText w:val="%1."/>
       <w:lvlJc w:val="left"/>
       <w:pPr>
-        <w:ind w:left="720" w:hanging="360"/>
+        <w:ind w:left="540" w:hanging="300"/>
       </w:pPr>
     </w:lvl>
-    <w:lvl w:ilvl="1" w:tplc="0B762F26" w:tentative="1">
-      <w:start w:val="1"/>
-      <w:numFmt w:val="bullet"/>
-      <w:lvlText w:val="○"/>
-      <w:lvlJc w:val="left"/>
-      <w:pPr>
-        <w:ind w:left="1440" w:hanging="360"/>
-      </w:pPr>
-    </w:lvl>
-    <w:lvl w:ilvl="2" w:tplc="290AD036" w:tentative="1">
-      <w:start w:val="1"/>
-      <w:numFmt w:val="bullet"/>
-      <w:lvlText w:val="■"/>
-      <w:lvlJc w:val="left"/>
-      <w:pPr>
-        <w:ind w:left="2160" w:hanging="360"/>
-      </w:pPr>
-    </w:lvl>
-    <w:lvl w:ilvl="3" w:tplc="235608A4" w:tentative="1">
-      <w:start w:val="1"/>
-      <w:numFmt w:val="bullet"/>
-      <w:lvlText w:val="●"/>
-      <w:lvlJc w:val="left"/>
-      <w:pPr>
-        <w:ind w:left="2880" w:hanging="360"/>
-      </w:pPr>
-    </w:lvl>
-    <w:lvl w:ilvl="4" w:tplc="C504D5F8" w:tentative="1">
-      <w:start w:val="1"/>
-      <w:numFmt w:val="bullet"/>
-      <w:lvlText w:val="○"/>
-      <w:lvlJc w:val="left"/>
-      <w:pPr>
-        <w:ind w:left="3600" w:hanging="360"/>
-      </w:pPr>
-    </w:lvl>
-    <w:lvl w:ilvl="5" w:tplc="1820D0A2" w:tentative="1">
-      <w:start w:val="1"/>
-      <w:numFmt w:val="bullet"/>
-      <w:lvlText w:val="■"/>
-      <w:lvlJc w:val="left"/>
-      <w:pPr>
-        <w:ind w:left="4320" w:hanging="360"/>
-      </w:pPr>
-    </w:lvl>
-    <w:lvl w:ilvl="6" w:tplc="8F3458D6" w:tentative="1">
-      <w:start w:val="1"/>
-      <w:numFmt w:val="bullet"/>
-      <w:lvlText w:val="●"/>
-      <w:lvlJc w:val="left"/>
-      <w:pPr>
-        <w:ind w:left="5040" w:hanging="360"/>
-      </w:pPr>
-    </w:lvl>
-    <w:lvl w:ilvl="7" w:tplc="607A9682" w:tentative="1">
-      <w:start w:val="1"/>
-      <w:numFmt w:val="bullet"/>
-      <w:lvlText w:val="●"/>
-      <w:lvlJc w:val="left"/>
-      <w:pPr>
-        <w:ind w:left="5760" w:hanging="360"/>
-      </w:pPr>
-    </w:lvl>
-    <w:lvl w:ilvl="8" w:tplc="A1EA0674" w:tentative="1">
-      <w:start w:val="1"/>
-      <w:numFmt w:val="bullet"/>
-      <w:lvlText w:val="●"/>
-      <w:lvlJc w:val="left"/>
-      <w:pPr>
-        <w:ind w:left="6480" w:hanging="360"/>
-      </w:pPr>
-    </w:lvl>
-  </w:abstractNum>
-  <w:abstractNum w:abstractNumId="1" w15:restartNumberingAfterBreak="0">
-    <w:nsid w:val="18B756FA"/>
-    <w:multiLevelType w:val="hybridMultilevel"/>
-    <w:tmpl w:val="F6A6DCA6"/>
-    <w:lvl w:ilvl="0" w:tplc="79006D6C">
-      <w:start w:val="1"/>
-      <w:numFmt w:val="bullet"/>
-      <w:lvlText w:val="•"/>
-      <w:lvlJc w:val="left"/>
-      <w:pPr>
-        <w:ind w:left="540" w:hanging="270"/>
-      </w:pPr>
-    </w:lvl>
-    <w:lvl w:ilvl="1" w:tplc="25A44E32" w:tentative="1">
-      <w:start w:val="1"/>
-      <w:numFmt w:val="bullet"/>
-      <w:lvlText w:val="–"/>
-      <w:lvlJc w:val="left"/>
-      <w:pPr>
-        <w:ind w:left="1080" w:hanging="270"/>
-      </w:pPr>
-    </w:lvl>
-    <w:lvl w:ilvl="2" w:tplc="48E4CF54">
+    <w:lvl w:ilvl="1" w:tplc="DAB4A6DC">
       <w:numFmt w:val="decimal"/>
       <w:lvlText w:val=""/>
       <w:lvlJc w:val="left"/>
     </w:lvl>
-    <w:lvl w:ilvl="3" w:tplc="65504E22">
+    <w:lvl w:ilvl="2" w:tplc="F70E98BE">
       <w:numFmt w:val="decimal"/>
       <w:lvlText w:val=""/>
       <w:lvlJc w:val="left"/>
     </w:lvl>
-    <w:lvl w:ilvl="4" w:tplc="D068A692">
+    <w:lvl w:ilvl="3" w:tplc="54F6C034">
       <w:numFmt w:val="decimal"/>
       <w:lvlText w:val=""/>
       <w:lvlJc w:val="left"/>
     </w:lvl>
-    <w:lvl w:ilvl="5" w:tplc="A6F6B726">
+    <w:lvl w:ilvl="4" w:tplc="2E90C804">
       <w:numFmt w:val="decimal"/>
       <w:lvlText w:val=""/>
       <w:lvlJc w:val="left"/>
     </w:lvl>
-    <w:lvl w:ilvl="6" w:tplc="C69E4E7A">
+    <w:lvl w:ilvl="5" w:tplc="D122BFD4">
       <w:numFmt w:val="decimal"/>
       <w:lvlText w:val=""/>
       <w:lvlJc w:val="left"/>
     </w:lvl>
-    <w:lvl w:ilvl="7" w:tplc="11A8B596">
+    <w:lvl w:ilvl="6" w:tplc="C76ADEB0">
       <w:numFmt w:val="decimal"/>
       <w:lvlText w:val=""/>
       <w:lvlJc w:val="left"/>
     </w:lvl>
-    <w:lvl w:ilvl="8" w:tplc="C1AEBDBE">
+    <w:lvl w:ilvl="7" w:tplc="B906922E">
+      <w:numFmt w:val="decimal"/>
+      <w:lvlText w:val=""/>
+      <w:lvlJc w:val="left"/>
+    </w:lvl>
+    <w:lvl w:ilvl="8" w:tplc="7F58C150">
       <w:numFmt w:val="decimal"/>
       <w:lvlText w:val=""/>
       <w:lvlJc w:val="left"/>
     </w:lvl>
   </w:abstractNum>
+  <w:abstractNum w:abstractNumId="1" w15:restartNumberingAfterBreak="0">
+    <w:nsid w:val="389F5F17"/>
+    <w:multiLevelType w:val="hybridMultilevel"/>
+    <w:tmpl w:val="3878A4FC"/>
+    <w:lvl w:ilvl="0" w:tplc="D1705EC2" w:tentative="1">
+      <w:start w:val="1"/>
+      <w:numFmt w:val="bullet"/>
+      <w:lvlText w:val="●"/>
+      <w:lvlJc w:val="left"/>
+      <w:pPr>
+        <w:ind w:left="720" w:hanging="360"/>
+      </w:pPr>
+    </w:lvl>
+    <w:lvl w:ilvl="1" w:tplc="CEAAC578" w:tentative="1">
+      <w:start w:val="1"/>
+      <w:numFmt w:val="bullet"/>
+      <w:lvlText w:val="○"/>
+      <w:lvlJc w:val="left"/>
+      <w:pPr>
+        <w:ind w:left="1440" w:hanging="360"/>
+      </w:pPr>
+    </w:lvl>
+    <w:lvl w:ilvl="2" w:tplc="2F485F4C" w:tentative="1">
+      <w:start w:val="1"/>
+      <w:numFmt w:val="bullet"/>
+      <w:lvlText w:val="■"/>
+      <w:lvlJc w:val="left"/>
+      <w:pPr>
+        <w:ind w:left="2160" w:hanging="360"/>
+      </w:pPr>
+    </w:lvl>
+    <w:lvl w:ilvl="3" w:tplc="7FEE481A" w:tentative="1">
+      <w:start w:val="1"/>
+      <w:numFmt w:val="bullet"/>
+      <w:lvlText w:val="●"/>
+      <w:lvlJc w:val="left"/>
+      <w:pPr>
+        <w:ind w:left="2880" w:hanging="360"/>
+      </w:pPr>
+    </w:lvl>
+    <w:lvl w:ilvl="4" w:tplc="77C06938" w:tentative="1">
+      <w:start w:val="1"/>
+      <w:numFmt w:val="bullet"/>
+      <w:lvlText w:val="○"/>
+      <w:lvlJc w:val="left"/>
+      <w:pPr>
+        <w:ind w:left="3600" w:hanging="360"/>
+      </w:pPr>
+    </w:lvl>
+    <w:lvl w:ilvl="5" w:tplc="02E20620" w:tentative="1">
+      <w:start w:val="1"/>
+      <w:numFmt w:val="bullet"/>
+      <w:lvlText w:val="■"/>
+      <w:lvlJc w:val="left"/>
+      <w:pPr>
+        <w:ind w:left="4320" w:hanging="360"/>
+      </w:pPr>
+    </w:lvl>
+    <w:lvl w:ilvl="6" w:tplc="6E1CCA70" w:tentative="1">
+      <w:start w:val="1"/>
+      <w:numFmt w:val="bullet"/>
+      <w:lvlText w:val="●"/>
+      <w:lvlJc w:val="left"/>
+      <w:pPr>
+        <w:ind w:left="5040" w:hanging="360"/>
+      </w:pPr>
+    </w:lvl>
+    <w:lvl w:ilvl="7" w:tplc="B928BB86" w:tentative="1">
+      <w:start w:val="1"/>
+      <w:numFmt w:val="bullet"/>
+      <w:lvlText w:val="●"/>
+      <w:lvlJc w:val="left"/>
+      <w:pPr>
+        <w:ind w:left="5760" w:hanging="360"/>
+      </w:pPr>
+    </w:lvl>
+    <w:lvl w:ilvl="8" w:tplc="B9523078" w:tentative="1">
+      <w:start w:val="1"/>
+      <w:numFmt w:val="bullet"/>
+      <w:lvlText w:val="●"/>
+      <w:lvlJc w:val="left"/>
+      <w:pPr>
+        <w:ind w:left="6480" w:hanging="360"/>
+      </w:pPr>
+    </w:lvl>
+  </w:abstractNum>
   <w:abstractNum w:abstractNumId="2" w15:restartNumberingAfterBreak="0">
-    <w:nsid w:val="1A474FA1"/>
+    <w:nsid w:val="404021B2"/>
     <w:multiLevelType w:val="hybridMultilevel"/>
-    <w:tmpl w:val="40C412C6"/>
-    <w:lvl w:ilvl="0" w:tplc="77E87F60">
+    <w:tmpl w:val="C7BAE3DE"/>
+    <w:lvl w:ilvl="0" w:tplc="4DCCF34A">
       <w:start w:val="1"/>
-      <w:numFmt w:val="decimal"/>
-      <w:lvlText w:val="%1."/>
+      <w:numFmt w:val="bullet"/>
+      <w:lvlText w:val="•"/>
       <w:lvlJc w:val="left"/>
       <w:pPr>
-        <w:ind w:left="540" w:hanging="300"/>
+        <w:ind w:left="540" w:hanging="270"/>
       </w:pPr>
     </w:lvl>
-    <w:lvl w:ilvl="1" w:tplc="FA24F83C">
+    <w:lvl w:ilvl="1" w:tplc="EED878F4" w:tentative="1">
+      <w:start w:val="1"/>
+      <w:numFmt w:val="bullet"/>
+      <w:lvlText w:val="–"/>
+      <w:lvlJc w:val="left"/>
+      <w:pPr>
+        <w:ind w:left="1080" w:hanging="270"/>
+      </w:pPr>
+    </w:lvl>
+    <w:lvl w:ilvl="2" w:tplc="A61056EA">
       <w:numFmt w:val="decimal"/>
       <w:lvlText w:val=""/>
       <w:lvlJc w:val="left"/>
     </w:lvl>
-    <w:lvl w:ilvl="2" w:tplc="DAF6C45E">
+    <w:lvl w:ilvl="3" w:tplc="D5A0D1A8">
       <w:numFmt w:val="decimal"/>
       <w:lvlText w:val=""/>
       <w:lvlJc w:val="left"/>
     </w:lvl>
-    <w:lvl w:ilvl="3" w:tplc="D3448CAA">
+    <w:lvl w:ilvl="4" w:tplc="B44C46AE">
       <w:numFmt w:val="decimal"/>
       <w:lvlText w:val=""/>
       <w:lvlJc w:val="left"/>
     </w:lvl>
-    <w:lvl w:ilvl="4" w:tplc="DEECA5CC">
+    <w:lvl w:ilvl="5" w:tplc="02E8ED3A">
       <w:numFmt w:val="decimal"/>
       <w:lvlText w:val=""/>
       <w:lvlJc w:val="left"/>
     </w:lvl>
-    <w:lvl w:ilvl="5" w:tplc="FE6643F2">
+    <w:lvl w:ilvl="6" w:tplc="67FE15E8">
       <w:numFmt w:val="decimal"/>
       <w:lvlText w:val=""/>
       <w:lvlJc w:val="left"/>
     </w:lvl>
-    <w:lvl w:ilvl="6" w:tplc="EB9099AA">
+    <w:lvl w:ilvl="7" w:tplc="A680FFB2">
       <w:numFmt w:val="decimal"/>
       <w:lvlText w:val=""/>
       <w:lvlJc w:val="left"/>
     </w:lvl>
-    <w:lvl w:ilvl="7" w:tplc="77289678">
-      <w:numFmt w:val="decimal"/>
-      <w:lvlText w:val=""/>
-      <w:lvlJc w:val="left"/>
-    </w:lvl>
-    <w:lvl w:ilvl="8" w:tplc="EBA2261E">
+    <w:lvl w:ilvl="8" w:tplc="DEEC856E">
       <w:numFmt w:val="decimal"/>
       <w:lvlText w:val=""/>
       <w:lvlJc w:val="left"/>
     </w:lvl>
   </w:abstractNum>
-  <w:num w:numId="1" w16cid:durableId="275064307">
-    <w:abstractNumId w:val="0"/>
+  <w:num w:numId="1" w16cid:durableId="1786539578">
+    <w:abstractNumId w:val="1"/>
     <w:lvlOverride w:ilvl="0">
       <w:startOverride w:val="1"/>
     </w:lvlOverride>
   </w:num>
-  <w:num w:numId="2" w16cid:durableId="1657952506">
-    <w:abstractNumId w:val="1"/>
+  <w:num w:numId="2" w16cid:durableId="932974493">
+    <w:abstractNumId w:val="2"/>
     <w:lvlOverride w:ilvl="0">
       <w:startOverride w:val="1"/>
     </w:lvlOverride>
@@ -11811,8 +11879,8 @@
       <w:startOverride w:val="1"/>
     </w:lvlOverride>
   </w:num>
-  <w:num w:numId="3" w16cid:durableId="678234948">
-    <w:abstractNumId w:val="2"/>
+  <w:num w:numId="3" w16cid:durableId="858742683">
+    <w:abstractNumId w:val="0"/>
     <w:lvlOverride w:ilvl="0">
       <w:startOverride w:val="1"/>
     </w:lvlOverride>

</xml_diff>